<commit_message>
Update assessor tool + handbook (2026-06-25)
</commit_message>
<xml_diff>
--- a/CAMEO-SAM_Assessor_Handbook.docx
+++ b/CAMEO-SAM_Assessor_Handbook.docx
@@ -1259,6 +1259,55 @@
         </w:rPr>
         <w:t>Also shown: the 95% confidence interval (how precise the estimate is), the number of primary studies (feeds Consistency), and the source systematic review (the “anchor”). “CI excludes the null” is the single most useful phrase in this work: it means the result is statistically distinguishable from no effect.</w:t>
       </w:r>
+    </w:p>
+    <w:tbl>
+      <w:tblPr>
+        <w:tblW w:type="auto" w:w="0"/>
+        <w:tblLook w:firstColumn="1" w:firstRow="1" w:lastColumn="0" w:lastRow="0" w:noHBand="0" w:noVBand="1" w:val="04A0"/>
+      </w:tblPr>
+      <w:tblGrid>
+        <w:gridCol w:w="9648"/>
+      </w:tblGrid>
+      <w:tr>
+        <w:tc>
+          <w:tcPr>
+            <w:tcW w:type="dxa" w:w="9648"/>
+            <w:shd w:val="clear" w:fill="F4F3F0"/>
+            <w:tcBorders>
+              <w:top w:val="single" w:sz="4" w:space="0" w:color="BBBBBB"/>
+              <w:bottom w:val="single" w:sz="4" w:space="0" w:color="BBBBBB"/>
+              <w:left w:val="single" w:sz="4" w:space="0" w:color="BBBBBB"/>
+              <w:right w:val="single" w:sz="4" w:space="0" w:color="BBBBBB"/>
+            </w:tcBorders>
+          </w:tcPr>
+          <w:p>
+            <w:pPr>
+              <w:spacing w:after="40"/>
+            </w:pPr>
+            <w:r/>
+            <w:r>
+              <w:rPr>
+                <w:rFonts w:ascii="Arial" w:hAnsi="Arial"/>
+                <w:b/>
+                <w:sz w:val="19"/>
+              </w:rPr>
+              <w:t xml:space="preserve">Provenance (one review per edge):  </w:t>
+            </w:r>
+            <w:r>
+              <w:rPr>
+                <w:rFonts w:ascii="Arial" w:hAnsi="Arial"/>
+                <w:sz w:val="19"/>
+              </w:rPr>
+              <w:t>each edge is informed by a single representative systematic review (its anchor), with the certified number of primary studies and the named primaries shown where available. Because one review informs each edge, inter-review overlap (corrected covered area) does not apply here; judge Consistency from the primary studies within that review.</w:t>
+            </w:r>
+          </w:p>
+        </w:tc>
+      </w:tr>
+    </w:tbl>
+    <w:p>
+      <w:pPr>
+        <w:spacing w:after="40"/>
+      </w:pPr>
     </w:p>
     <w:p>
       <w:pPr>

</xml_diff>

<commit_message>
Update assessor tool + handbook (2026-06-29)
</commit_message>
<xml_diff>
--- a/CAMEO-SAM_Assessor_Handbook.docx
+++ b/CAMEO-SAM_Assessor_Handbook.docx
@@ -64,7 +64,7 @@
           <w:i w:val="0"/>
           <w:sz w:val="20"/>
         </w:rPr>
-        <w:t>This handbook is the scoring manual for a second, independent assessor. Read it once before you begin; keep the quick-reference card (final page) beside you while you score.</w:t>
+        <w:t>This handbook is the scoring manual for an independent assessor. Read it once before you begin; keep the quick-reference card (final page) beside you while you score.</w:t>
       </w:r>
     </w:p>
     <w:tbl>
@@ -462,7 +462,7 @@
           <w:b w:val="0"/>
           <w:i w:val="0"/>
         </w:rPr>
-        <w:t>You are a second, independent assessor. For each causal edge — a single proposed cause → effect link, for example “zinc supplementation → acute morbidity” — you will judge how strongly the available evidence supports a causal interpretation, using the six Bradford Hill criteria. A first assessment already exists; your scores are compared with it to measure agreement (the intraclass correlation coefficient, ICC), as the registered protocol requires.</w:t>
+        <w:t>You are one of the independent human assessors. For each causal edge — a single proposed cause → effect link, for example “zinc supplementation → acute morbidity” — you will judge how strongly the available evidence supports a causal interpretation, using the six Bradford Hill criteria. A provisional computational reference already exists for internal comparison, and another human assessor scores independently; the returned human scores are compared to measure agreement (the intraclass correlation coefficient, ICC), as the registered protocol requires.</w:t>
       </w:r>
     </w:p>
     <w:p>
@@ -918,7 +918,7 @@
           <w:b w:val="0"/>
           <w:i w:val="0"/>
         </w:rPr>
-        <w:t>There are roughly 137 edges. Most take under a minute once you are warmed up; you can do them in several sittings. Use the Q1 / Q2 / Q3 and Unscored / Flagged filters to organise your work.</w:t>
+        <w:t>There are roughly 131 edges. Most take under a minute once you are warmed up; you can do them in several sittings. Use the Q1 / Q2 / Q3 and Unscored / Flagged filters to organise your work.</w:t>
       </w:r>
     </w:p>
     <w:p>
@@ -5606,7 +5606,7 @@
           <w:b w:val="0"/>
           <w:i w:val="0"/>
         </w:rPr>
-        <w:t>Every flagged edge, every edge where the two assessors land in different tiers, and every edge with a large gap on any criterion goes onto an adjudication worklist. You and the first assessor (with a third reviewer if needed) settle those together. The inter-rater agreement is reported in the methods; the reconciled tiers become the figures. Your independent scores — including your disagreements — are precisely what the process needs.</w:t>
+        <w:t>Every flagged edge, every edge where the two assessors land in different tiers, and every edge with a large gap on any criterion goes onto an adjudication worklist. The assessors (with a third reviewer if needed) settle those together. The inter-rater agreement is reported in the methods; the reconciled tiers become the figures. Your independent scores — including your disagreements — are precisely what the process needs.</w:t>
       </w:r>
     </w:p>
     <w:p>

</xml_diff>